<commit_message>
update workflow outline in Notes
</commit_message>
<xml_diff>
--- a/Notes/Notes.docx
+++ b/Notes/Notes.docx
@@ -88,7 +88,39 @@
         </w:numPr>
       </w:pPr>
       <w:r>
-        <w:t>Value check some columns</w:t>
+        <w:t xml:space="preserve">Value </w:t>
+      </w:r>
+      <w:proofErr w:type="gramStart"/>
+      <w:r>
+        <w:t>check</w:t>
+      </w:r>
+      <w:proofErr w:type="gramEnd"/>
+      <w:r>
+        <w:t xml:space="preserve"> some columns</w:t>
+      </w:r>
+    </w:p>
+    <w:p>
+      <w:pPr>
+        <w:pStyle w:val="ListParagraph"/>
+        <w:numPr>
+          <w:ilvl w:val="2"/>
+          <w:numId w:val="3"/>
+        </w:numPr>
+      </w:pPr>
+      <w:r>
+        <w:t>Functions based on expected values</w:t>
+      </w:r>
+    </w:p>
+    <w:p>
+      <w:pPr>
+        <w:pStyle w:val="ListParagraph"/>
+        <w:numPr>
+          <w:ilvl w:val="2"/>
+          <w:numId w:val="3"/>
+        </w:numPr>
+      </w:pPr>
+      <w:r>
+        <w:t>Visualization functions (histograms or scatterplots)</w:t>
       </w:r>
     </w:p>
     <w:p>
@@ -158,15 +190,28 @@
       </w:r>
       <w:proofErr w:type="spellEnd"/>
       <w:r>
-        <w:t>, [16s/18s/other]_</w:t>
+        <w:t>, [16s/18s/</w:t>
+      </w:r>
+      <w:proofErr w:type="gramStart"/>
+      <w:r>
+        <w:t>other]_</w:t>
       </w:r>
       <w:proofErr w:type="spellStart"/>
+      <w:proofErr w:type="gramEnd"/>
       <w:r>
         <w:t>Fastq_ID</w:t>
       </w:r>
       <w:proofErr w:type="spellEnd"/>
       <w:r>
-        <w:t xml:space="preserve">, and [16s/18s/other]_run info.  </w:t>
+        <w:t>, and [16s/18s/</w:t>
+      </w:r>
+      <w:proofErr w:type="gramStart"/>
+      <w:r>
+        <w:t>other]_</w:t>
+      </w:r>
+      <w:proofErr w:type="gramEnd"/>
+      <w:r>
+        <w:t xml:space="preserve">run info.  </w:t>
       </w:r>
     </w:p>
     <w:p>
@@ -420,7 +465,7 @@
         <w:ind w:left="1440" w:hanging="360"/>
       </w:pPr>
     </w:lvl>
-    <w:lvl w:ilvl="2" w:tplc="0409001B" w:tentative="1">
+    <w:lvl w:ilvl="2" w:tplc="0409001B">
       <w:start w:val="1"/>
       <w:numFmt w:val="lowerRoman"/>
       <w:lvlText w:val="%3."/>

</xml_diff>